<commit_message>
male izmjene; MM uredjaji in-progress
</commit_message>
<xml_diff>
--- a/Osmobitni Studentski Mikroprocesor i Asembler za Nastavu.docx
+++ b/Osmobitni Studentski Mikroprocesor i Asembler za Nastavu.docx
@@ -15637,32 +15637,7 @@
         </w:numPr>
       </w:pPr>
       <w:r>
-        <w:t>Testirati ovu metodu za pretvaranje hex brojeva (zbog negativnih) i generalni tretman brojeva negativnih u asembleru</w:t>
-      </w:r>
-    </w:p>
-    <w:p>
-      <w:pPr>
-        <w:pStyle w:val="ListParagraph"/>
-        <w:numPr>
-          <w:ilvl w:val="0"/>
-          <w:numId w:val="4"/>
-        </w:numPr>
-      </w:pPr>
-      <w:r>
-        <w:t>Mala slova za registre?</w:t>
-      </w:r>
-    </w:p>
-    <w:p>
-      <w:pPr>
-        <w:pStyle w:val="ListParagraph"/>
-        <w:numPr>
-          <w:ilvl w:val="0"/>
-          <w:numId w:val="4"/>
-        </w:numPr>
-      </w:pPr>
-      <w:r>
-        <w:lastRenderedPageBreak/>
-        <w:t>Provjera opsega immediate vrijednosti ne radi za neoznacene brojeve. Gemini dao glupu ideju a ja sam predlozio nekako da se poredi sa 0xFF i vidim da li moze u to stati</w:t>
+        <w:t>Da li da stabilizatorski registri rade na rising ili na falling edge?</w:t>
       </w:r>
     </w:p>
     <w:p>
@@ -15682,6 +15657,7 @@
     </w:p>
     <w:p>
       <w:r>
+        <w:lastRenderedPageBreak/>
         <w:t>Smjesti lokalno I ucitaj lokalno, INC DEC, INSP, DESP</w:t>
       </w:r>
     </w:p>

</xml_diff>

<commit_message>
asembler implementiran; bug sa LD instrukcijom zbog nacina rada RAM-a
</commit_message>
<xml_diff>
--- a/Osmobitni Studentski Mikroprocesor i Asembler za Nastavu.docx
+++ b/Osmobitni Studentski Mikroprocesor i Asembler za Nastavu.docx
@@ -15642,6 +15642,52 @@
     </w:p>
     <w:p>
       <w:pPr>
+        <w:pStyle w:val="ListParagraph"/>
+        <w:numPr>
+          <w:ilvl w:val="0"/>
+          <w:numId w:val="4"/>
+        </w:numPr>
+      </w:pPr>
+      <w:r>
+        <w:t xml:space="preserve">Da li dodavati delay na sat? Na primjer, trenutno kada trazimo upis iz UI uredjaja, ako je LD instrukcija prva, nece se desiti ni jedan rising edge, tako da nece biti procitano kako treba. S druge strane, ako stavimo na falling edge, onda nece stici da se stabilizuje </w:t>
+      </w:r>
+      <w:r>
+        <w:lastRenderedPageBreak/>
+        <w:t>najnovija vrijednost jer se podaci u isto vrijeme trebaju pisati u registar. Tehnicki je jedino ispravno rising edge. Dakle koja god instrukcija bude prva, a okinemo RST, generalno pola njenih stvari nece mozda raditi tj sta god se upisuje na rising edge sve.</w:t>
+      </w:r>
+    </w:p>
+    <w:p>
+      <w:pPr>
+        <w:pStyle w:val="ListParagraph"/>
+        <w:numPr>
+          <w:ilvl w:val="0"/>
+          <w:numId w:val="4"/>
+        </w:numPr>
+      </w:pPr>
+      <w:r>
+        <w:t>Evo testirao sam to i sa ovim programom koji pali razlicite ledove na osnovu button clicka. Dakle ako se klik ne ocita na rising-edgeu prethodne instrukcije, nece se moci ocitati tj registrovati na rising-edgeu same instrukcije koja cita taj memorijski mapirani uredjaj. Da li je ovo problem?</w:t>
+      </w:r>
+      <w:r>
+        <w:t xml:space="preserve"> Mislim evo i sad ako citam iz onog dip switcha pa onda citam unos buttona ono kao lako moze profulati? Mislim tehnicki ne moze jer je frekvencija velika ali ono moze fulat jedan ciklus viska mozda? Jer ono bukv mi utice da li prvo citam button ili dip switch. Ne znam mozda malo previse u detalje idem jer objektivno ove se stvari ne primjete kad je frekvencija dovoljno velika ali opet bi trebalo sve da radi sto je moguce brze i korektnije pa me zanima da li je ovo ovako najbolja implementacija.</w:t>
+      </w:r>
+      <w:r>
+        <w:t xml:space="preserve"> Mislim kao cudan mi je koncept jer kao ja pritisnem button na 0.000001s samo da uhvati onaj rising edge instrukcije prije i kao to je to</w:t>
+      </w:r>
+    </w:p>
+    <w:p>
+      <w:pPr>
+        <w:pStyle w:val="ListParagraph"/>
+        <w:numPr>
+          <w:ilvl w:val="0"/>
+          <w:numId w:val="4"/>
+        </w:numPr>
+      </w:pPr>
+      <w:r>
+        <w:t>Za sve ove probleme oko rising i falling edge razmisliti o konfiguracijama koje pisu kada je signal low ili high bez potrebe za ivicom</w:t>
+      </w:r>
+    </w:p>
+    <w:p>
+      <w:pPr>
         <w:pStyle w:val="Heading1"/>
       </w:pPr>
       <w:bookmarkStart w:id="12" w:name="_Toc230647743"/>
@@ -15657,7 +15703,6 @@
     </w:p>
     <w:p>
       <w:r>
-        <w:lastRenderedPageBreak/>
         <w:t>Smjesti lokalno I ucitaj lokalno, INC DEC, INSP, DESP</w:t>
       </w:r>
     </w:p>
@@ -16198,6 +16243,7 @@
       </w:pPr>
       <w:bookmarkStart w:id="15" w:name="_Toc230647746"/>
       <w:r>
+        <w:lastRenderedPageBreak/>
         <w:t>ADD</w:t>
       </w:r>
       <w:bookmarkEnd w:id="15"/>

</xml_diff>

<commit_message>
popravljen RAM za sad koristenjem duplog sata sa phase offsetom; popravljen nacin rada RST signala; ispravke u asembleru, ostalo jos 10% da se doradi
</commit_message>
<xml_diff>
--- a/Osmobitni Studentski Mikroprocesor i Asembler za Nastavu.docx
+++ b/Osmobitni Studentski Mikroprocesor i Asembler za Nastavu.docx
@@ -5441,7 +5441,14 @@
                 <w:sz w:val="20"/>
                 <w:szCs w:val="20"/>
               </w:rPr>
-              <w:t>LOC</w:t>
+              <w:t>L</w:t>
+            </w:r>
+            <w:r>
+              <w:rPr>
+                <w:sz w:val="20"/>
+                <w:szCs w:val="20"/>
+              </w:rPr>
+              <w:t>I</w:t>
             </w:r>
           </w:p>
         </w:tc>
@@ -12413,7 +12420,14 @@
                 <w:sz w:val="20"/>
                 <w:szCs w:val="20"/>
               </w:rPr>
-              <w:t>LOC</w:t>
+              <w:t>L</w:t>
+            </w:r>
+            <w:r>
+              <w:rPr>
+                <w:sz w:val="20"/>
+                <w:szCs w:val="20"/>
+              </w:rPr>
+              <w:t>I</w:t>
             </w:r>
           </w:p>
         </w:tc>
@@ -15496,7 +15510,20 @@
       <w:bookmarkEnd w:id="11"/>
     </w:p>
     <w:p>
-      <w:r>
+      <w:pPr>
+        <w:pStyle w:val="ListParagraph"/>
+        <w:numPr>
+          <w:ilvl w:val="0"/>
+          <w:numId w:val="5"/>
+        </w:numPr>
+      </w:pPr>
+      <w:r>
+        <w:t>Prepraviti citavu ovu sekciju ispod, puna je starih pitanja. Takodjer potrebno je dosta stvari ponovo dokumentovati, a i dodati napomene o novinama poput sinhronizacije RST signala i dodavanja MemCLK.</w:t>
+      </w:r>
+    </w:p>
+    <w:p>
+      <w:r>
+        <w:lastRenderedPageBreak/>
         <w:t>Glavna pitanja:</w:t>
       </w:r>
     </w:p>
@@ -15509,7 +15536,6 @@
         </w:numPr>
       </w:pPr>
       <w:r>
-        <w:lastRenderedPageBreak/>
         <w:t>Da li moramo dodavati ono dijeljenje clocka sa delayevima jer tipa ako ram piše na uzlaznu jednostavno se neće stić izračunat vrijednost, a ako piše na silaznu onda se u memoriju neće stić upisat na silaznoj</w:t>
       </w:r>
       <w:r>
@@ -15649,11 +15675,8 @@
         </w:numPr>
       </w:pPr>
       <w:r>
-        <w:t xml:space="preserve">Da li dodavati delay na sat? Na primjer, trenutno kada trazimo upis iz UI uredjaja, ako je LD instrukcija prva, nece se desiti ni jedan rising edge, tako da nece biti procitano kako treba. S druge strane, ako stavimo na falling edge, onda nece stici da se stabilizuje </w:t>
-      </w:r>
-      <w:r>
         <w:lastRenderedPageBreak/>
-        <w:t>najnovija vrijednost jer se podaci u isto vrijeme trebaju pisati u registar. Tehnicki je jedino ispravno rising edge. Dakle koja god instrukcija bude prva, a okinemo RST, generalno pola njenih stvari nece mozda raditi tj sta god se upisuje na rising edge sve.</w:t>
+        <w:t>Da li dodavati delay na sat? Na primjer, trenutno kada trazimo upis iz UI uredjaja, ako je LD instrukcija prva, nece se desiti ni jedan rising edge, tako da nece biti procitano kako treba. S druge strane, ako stavimo na falling edge, onda nece stici da se stabilizuje najnovija vrijednost jer se podaci u isto vrijeme trebaju pisati u registar. Tehnicki je jedino ispravno rising edge. Dakle koja god instrukcija bude prva, a okinemo RST, generalno pola njenih stvari nece mozda raditi tj sta god se upisuje na rising edge sve.</w:t>
       </w:r>
     </w:p>
     <w:p>
@@ -15684,6 +15707,30 @@
       </w:pPr>
       <w:r>
         <w:t>Za sve ove probleme oko rising i falling edge razmisliti o konfiguracijama koje pisu kada je signal low ili high bez potrebe za ivicom</w:t>
+      </w:r>
+    </w:p>
+    <w:p>
+      <w:pPr>
+        <w:pStyle w:val="ListParagraph"/>
+        <w:numPr>
+          <w:ilvl w:val="0"/>
+          <w:numId w:val="4"/>
+        </w:numPr>
+      </w:pPr>
+      <w:r>
+        <w:t>Za sta nam sluze .data i .code kad me ja mislim nista ne sprijecava da pisem kod u .data sekciji. Jedino se moze trenutno iskoristiti da se provjeri da li je lupam za addi data labela nekog data objekta ali ja mislim da je to to</w:t>
+      </w:r>
+    </w:p>
+    <w:p>
+      <w:pPr>
+        <w:pStyle w:val="ListParagraph"/>
+        <w:numPr>
+          <w:ilvl w:val="0"/>
+          <w:numId w:val="4"/>
+        </w:numPr>
+      </w:pPr>
+      <w:r>
+        <w:t>Ima li opasnosti sto se dozvoljava bez zareza equ</w:t>
       </w:r>
     </w:p>
     <w:p>
@@ -15998,6 +16045,7 @@
               <w:jc w:val="center"/>
             </w:pPr>
             <w:r>
+              <w:lastRenderedPageBreak/>
               <w:t>0000</w:t>
             </w:r>
           </w:p>
@@ -16018,6 +16066,7 @@
               <w:jc w:val="center"/>
             </w:pPr>
             <w:r>
+              <w:lastRenderedPageBreak/>
               <w:t>000</w:t>
             </w:r>
           </w:p>
@@ -16067,6 +16116,7 @@
               <w:jc w:val="center"/>
             </w:pPr>
             <w:r>
+              <w:lastRenderedPageBreak/>
               <w:t>000000</w:t>
             </w:r>
           </w:p>
@@ -16099,6 +16149,7 @@
                 <w:sz w:val="22"/>
                 <w:szCs w:val="20"/>
               </w:rPr>
+              <w:lastRenderedPageBreak/>
               <w:t>4</w:t>
             </w:r>
           </w:p>
@@ -16243,7 +16294,6 @@
       </w:pPr>
       <w:bookmarkStart w:id="15" w:name="_Toc230647746"/>
       <w:r>
-        <w:lastRenderedPageBreak/>
         <w:t>ADD</w:t>
       </w:r>
       <w:bookmarkEnd w:id="15"/>
@@ -17164,6 +17214,118 @@
     </w:lvl>
   </w:abstractNum>
   <w:abstractNum w:abstractNumId="3" w15:restartNumberingAfterBreak="0">
+    <w:nsid w:val="552658E8"/>
+    <w:multiLevelType w:val="hybridMultilevel"/>
+    <w:tmpl w:val="B444103A"/>
+    <w:lvl w:ilvl="0" w:tplc="AAFAA828">
+      <w:numFmt w:val="bullet"/>
+      <w:lvlText w:val="-"/>
+      <w:lvlJc w:val="left"/>
+      <w:pPr>
+        <w:ind w:left="720" w:hanging="360"/>
+      </w:pPr>
+      <w:rPr>
+        <w:rFonts w:ascii="Times New Roman" w:eastAsiaTheme="minorHAnsi" w:hAnsi="Times New Roman" w:cs="Times New Roman" w:hint="default"/>
+      </w:rPr>
+    </w:lvl>
+    <w:lvl w:ilvl="1" w:tplc="08090003" w:tentative="1">
+      <w:start w:val="1"/>
+      <w:numFmt w:val="bullet"/>
+      <w:lvlText w:val="o"/>
+      <w:lvlJc w:val="left"/>
+      <w:pPr>
+        <w:ind w:left="1440" w:hanging="360"/>
+      </w:pPr>
+      <w:rPr>
+        <w:rFonts w:ascii="Courier New" w:hAnsi="Courier New" w:cs="Courier New" w:hint="default"/>
+      </w:rPr>
+    </w:lvl>
+    <w:lvl w:ilvl="2" w:tplc="08090005" w:tentative="1">
+      <w:start w:val="1"/>
+      <w:numFmt w:val="bullet"/>
+      <w:lvlText w:val=""/>
+      <w:lvlJc w:val="left"/>
+      <w:pPr>
+        <w:ind w:left="2160" w:hanging="360"/>
+      </w:pPr>
+      <w:rPr>
+        <w:rFonts w:ascii="Wingdings" w:hAnsi="Wingdings" w:hint="default"/>
+      </w:rPr>
+    </w:lvl>
+    <w:lvl w:ilvl="3" w:tplc="08090001" w:tentative="1">
+      <w:start w:val="1"/>
+      <w:numFmt w:val="bullet"/>
+      <w:lvlText w:val=""/>
+      <w:lvlJc w:val="left"/>
+      <w:pPr>
+        <w:ind w:left="2880" w:hanging="360"/>
+      </w:pPr>
+      <w:rPr>
+        <w:rFonts w:ascii="Symbol" w:hAnsi="Symbol" w:hint="default"/>
+      </w:rPr>
+    </w:lvl>
+    <w:lvl w:ilvl="4" w:tplc="08090003" w:tentative="1">
+      <w:start w:val="1"/>
+      <w:numFmt w:val="bullet"/>
+      <w:lvlText w:val="o"/>
+      <w:lvlJc w:val="left"/>
+      <w:pPr>
+        <w:ind w:left="3600" w:hanging="360"/>
+      </w:pPr>
+      <w:rPr>
+        <w:rFonts w:ascii="Courier New" w:hAnsi="Courier New" w:cs="Courier New" w:hint="default"/>
+      </w:rPr>
+    </w:lvl>
+    <w:lvl w:ilvl="5" w:tplc="08090005" w:tentative="1">
+      <w:start w:val="1"/>
+      <w:numFmt w:val="bullet"/>
+      <w:lvlText w:val=""/>
+      <w:lvlJc w:val="left"/>
+      <w:pPr>
+        <w:ind w:left="4320" w:hanging="360"/>
+      </w:pPr>
+      <w:rPr>
+        <w:rFonts w:ascii="Wingdings" w:hAnsi="Wingdings" w:hint="default"/>
+      </w:rPr>
+    </w:lvl>
+    <w:lvl w:ilvl="6" w:tplc="08090001" w:tentative="1">
+      <w:start w:val="1"/>
+      <w:numFmt w:val="bullet"/>
+      <w:lvlText w:val=""/>
+      <w:lvlJc w:val="left"/>
+      <w:pPr>
+        <w:ind w:left="5040" w:hanging="360"/>
+      </w:pPr>
+      <w:rPr>
+        <w:rFonts w:ascii="Symbol" w:hAnsi="Symbol" w:hint="default"/>
+      </w:rPr>
+    </w:lvl>
+    <w:lvl w:ilvl="7" w:tplc="08090003" w:tentative="1">
+      <w:start w:val="1"/>
+      <w:numFmt w:val="bullet"/>
+      <w:lvlText w:val="o"/>
+      <w:lvlJc w:val="left"/>
+      <w:pPr>
+        <w:ind w:left="5760" w:hanging="360"/>
+      </w:pPr>
+      <w:rPr>
+        <w:rFonts w:ascii="Courier New" w:hAnsi="Courier New" w:cs="Courier New" w:hint="default"/>
+      </w:rPr>
+    </w:lvl>
+    <w:lvl w:ilvl="8" w:tplc="08090005" w:tentative="1">
+      <w:start w:val="1"/>
+      <w:numFmt w:val="bullet"/>
+      <w:lvlText w:val=""/>
+      <w:lvlJc w:val="left"/>
+      <w:pPr>
+        <w:ind w:left="6480" w:hanging="360"/>
+      </w:pPr>
+      <w:rPr>
+        <w:rFonts w:ascii="Wingdings" w:hAnsi="Wingdings" w:hint="default"/>
+      </w:rPr>
+    </w:lvl>
+  </w:abstractNum>
+  <w:abstractNum w:abstractNumId="4" w15:restartNumberingAfterBreak="0">
     <w:nsid w:val="6DAB03ED"/>
     <w:multiLevelType w:val="hybridMultilevel"/>
     <w:tmpl w:val="3F24ABF8"/>
@@ -17253,7 +17415,7 @@
     </w:lvl>
   </w:abstractNum>
   <w:num w:numId="1" w16cid:durableId="2015178872">
-    <w:abstractNumId w:val="3"/>
+    <w:abstractNumId w:val="4"/>
   </w:num>
   <w:num w:numId="2" w16cid:durableId="805128401">
     <w:abstractNumId w:val="0"/>
@@ -17263,6 +17425,9 @@
   </w:num>
   <w:num w:numId="4" w16cid:durableId="869681906">
     <w:abstractNumId w:val="1"/>
+  </w:num>
+  <w:num w:numId="5" w16cid:durableId="2042627537">
+    <w:abstractNumId w:val="3"/>
   </w:num>
 </w:numbering>
 </file>

</xml_diff>